<commit_message>
feat(extraction): connexion par connexion.env, mot de passe saisi à chaque lancement
La DAP n'a plus qu'une commande à taper : bash lancer_extraction.sh.

- connexion.env (serveur, port, base, compte), rempli une fois à partir de
  connexion.exemple.env, non versionné. Lu ligne à ligne : insensible aux fins
  de ligne Windows et à la marque BOM du Bloc-notes. Une variable déjà définie
  dans le terminal reste prioritaire ; une ligne PGPASSWORD est refusée.
- Mot de passe demandé à chaque lancement par le lanceur (saisie masquée),
  jamais enregistré, transmis au seul psql de l'exécution puis effacé ; psql
  lancé avec -w pour échouer net sur un mauvais mot de passe. Saisie par bash :
  sous Git Bash, l'invite de psql.exe peut ne pas s'afficher (mintty).
- Procédure : connexion, mot de passe, winpty pour les contrôles ponctuels,
  nouveaux messages de dépannage.

Co-Authored-By: Claude Opus 5.5 <noreply@anthropic.com>
</commit_message>
<xml_diff>
--- a/SCRIPT/SCRIPT/Procedure_execution_extraction_mSupply.docx
+++ b/SCRIPT/SCRIPT/Procedure_execution_extraction_mSupply.docx
@@ -512,6 +512,102 @@
                 <w:b w:val="0"/>
                 <w:sz w:val="19"/>
               </w:rPr>
+              <w:t>connexion.env</w:t>
+            </w:r>
+          </w:p>
+        </w:tc>
+        <w:tc>
+          <w:tcPr>
+            <w:tcW w:type="dxa" w:w="3402"/>
+          </w:tcPr>
+          <w:p>
+            <w:r/>
+            <w:r>
+              <w:rPr>
+                <w:b w:val="0"/>
+                <w:sz w:val="19"/>
+              </w:rPr>
+              <w:t>Serveur, base et compte de connexion à mSupply (sans mot de passe)</w:t>
+            </w:r>
+          </w:p>
+        </w:tc>
+        <w:tc>
+          <w:tcPr>
+            <w:tcW w:type="dxa" w:w="2721"/>
+          </w:tcPr>
+          <w:p>
+            <w:r/>
+            <w:r>
+              <w:rPr>
+                <w:b w:val="0"/>
+                <w:sz w:val="19"/>
+              </w:rPr>
+              <w:t>Une fois, à la première installation</w:t>
+            </w:r>
+          </w:p>
+        </w:tc>
+      </w:tr>
+      <w:tr>
+        <w:tc>
+          <w:tcPr>
+            <w:tcW w:type="dxa" w:w="2948"/>
+          </w:tcPr>
+          <w:p>
+            <w:r/>
+            <w:r>
+              <w:rPr>
+                <w:rFonts w:ascii="Consolas" w:hAnsi="Consolas"/>
+                <w:b w:val="0"/>
+                <w:sz w:val="19"/>
+              </w:rPr>
+              <w:t>connexion.exemple.env</w:t>
+            </w:r>
+          </w:p>
+        </w:tc>
+        <w:tc>
+          <w:tcPr>
+            <w:tcW w:type="dxa" w:w="3402"/>
+          </w:tcPr>
+          <w:p>
+            <w:r/>
+            <w:r>
+              <w:rPr>
+                <w:b w:val="0"/>
+                <w:sz w:val="19"/>
+              </w:rPr>
+              <w:t>Modèle de connexion.env</w:t>
+            </w:r>
+          </w:p>
+        </w:tc>
+        <w:tc>
+          <w:tcPr>
+            <w:tcW w:type="dxa" w:w="2721"/>
+          </w:tcPr>
+          <w:p>
+            <w:r/>
+            <w:r>
+              <w:rPr>
+                <w:b w:val="0"/>
+                <w:sz w:val="19"/>
+              </w:rPr>
+              <w:t>Non</w:t>
+            </w:r>
+          </w:p>
+        </w:tc>
+      </w:tr>
+      <w:tr>
+        <w:tc>
+          <w:tcPr>
+            <w:tcW w:type="dxa" w:w="2948"/>
+          </w:tcPr>
+          <w:p>
+            <w:r/>
+            <w:r>
+              <w:rPr>
+                <w:rFonts w:ascii="Consolas" w:hAnsi="Consolas"/>
+                <w:b w:val="0"/>
+                <w:sz w:val="19"/>
+              </w:rPr>
               <w:t>lancer_extraction.sh</w:t>
             </w:r>
           </w:p>
@@ -962,12 +1058,20 @@
     </w:tbl>
     <w:p/>
     <w:p>
+      <w:pPr>
+        <w:pStyle w:val="Heading2"/>
+      </w:pPr>
+      <w:r>
+        <w:t>3.1 Connexion : le fichier connexion.env</w:t>
+      </w:r>
+    </w:p>
+    <w:p>
       <w:r>
         <w:rPr>
           <w:b w:val="0"/>
           <w:i w:val="0"/>
         </w:rPr>
-        <w:t>Mot de passe : ne jamais l'écrire dans les scripts. Le plus simple est un fichier .pgpass dans le dossier personnel, lisible par vous seul :</w:t>
+        <w:t>Copier connexion.exemple.env sous le nom connexion.env, dans le dossier des scripts, l'ouvrir avec le Bloc-notes et remplacer les valeurs. Le lanceur le lit à chaque exécution : il n'y a plus rien à taper.</w:t>
       </w:r>
     </w:p>
     <w:tbl>
@@ -992,7 +1096,7 @@
                 <w:rFonts w:ascii="Consolas" w:hAnsi="Consolas"/>
                 <w:sz w:val="18"/>
               </w:rPr>
-              <w:t># ~/.pgpass  (une ligne par connexion)</w:t>
+              <w:t>PGHOST=&lt;nom ou adresse du serveur&gt;</w:t>
               <w:br/>
             </w:r>
             <w:r>
@@ -1000,7 +1104,7 @@
                 <w:rFonts w:ascii="Consolas" w:hAnsi="Consolas"/>
                 <w:sz w:val="18"/>
               </w:rPr>
-              <w:t>&lt;serveur&gt;:5432:&lt;base&gt;:&lt;compte&gt;:&lt;mot de passe&gt;</w:t>
+              <w:t>PGPORT=5432</w:t>
               <w:br/>
             </w:r>
             <w:r>
@@ -1008,6 +1112,7 @@
                 <w:rFonts w:ascii="Consolas" w:hAnsi="Consolas"/>
                 <w:sz w:val="18"/>
               </w:rPr>
+              <w:t>PGDATABASE=&lt;base mSupply&gt;</w:t>
               <w:br/>
             </w:r>
             <w:r>
@@ -1015,7 +1120,7 @@
                 <w:rFonts w:ascii="Consolas" w:hAnsi="Consolas"/>
                 <w:sz w:val="18"/>
               </w:rPr>
-              <w:t>chmod 600 ~/.pgpass</w:t>
+              <w:t>PGUSER=&lt;compte en lecture seule&gt;</w:t>
             </w:r>
           </w:p>
         </w:tc>
@@ -1023,12 +1128,20 @@
     </w:tbl>
     <w:p/>
     <w:p>
+      <w:pPr>
+        <w:pStyle w:val="Heading2"/>
+      </w:pPr>
+      <w:r>
+        <w:t>3.2 Mot de passe : saisi à chaque lancement</w:t>
+      </w:r>
+    </w:p>
+    <w:p>
       <w:r>
         <w:rPr>
           <w:b w:val="0"/>
           <w:i w:val="0"/>
         </w:rPr>
-        <w:t>À défaut, psql demandera le mot de passe au lancement.</w:t>
+        <w:t>Le lanceur demande le mot de passe du compte à chaque exécution. La saisie ne s'affiche pas à l'écran ; c'est normal. Le mot de passe n'est enregistré nulle part : ni dans connexion.env (le lanceur refuse une ligne PGPASSWORD), ni dans un fichier de mots de passe.</w:t>
       </w:r>
     </w:p>
     <w:p>
@@ -1070,13 +1183,22 @@
                 <w:rFonts w:ascii="Consolas" w:hAnsi="Consolas"/>
                 <w:sz w:val="18"/>
               </w:rPr>
-              <w:t>psql -X -h &lt;serveur&gt; -U &lt;compte&gt; -d &lt;base&gt; -f controle_numero_inventaire.sql</w:t>
+              <w:t>winpty psql -X -h &lt;serveur&gt; -U &lt;compte&gt; -d &lt;base&gt; -f controle_numero_inventaire.sql</w:t>
             </w:r>
           </w:p>
         </w:tc>
       </w:tr>
     </w:tbl>
     <w:p/>
+    <w:p>
+      <w:r>
+        <w:rPr>
+          <w:b w:val="0"/>
+          <w:i/>
+        </w:rPr>
+        <w:t>winpty (fourni avec Git Bash) permet à psql d'afficher sa demande de mot de passe ; sans lui, psql peut sembler bloqué. Le lanceur, lui, n'en a pas besoin : il pose la question lui-même.</w:t>
+      </w:r>
+    </w:p>
     <w:p>
       <w:pPr>
         <w:pStyle w:val="ListBullet"/>
@@ -1751,7 +1873,7 @@
           <w:b w:val="0"/>
           <w:i w:val="0"/>
         </w:rPr>
-        <w:t>Dans un terminal (Linux) ou dans Git Bash (Windows), depuis le dossier qui contient les scripts :</w:t>
+        <w:t>Dans Git Bash (Windows) ou un terminal (Linux), depuis le dossier qui contient les scripts. La connexion vient de connexion.env (section 3.1) :</w:t>
       </w:r>
     </w:p>
     <w:tbl>
@@ -1777,52 +1899,6 @@
                 <w:sz w:val="18"/>
               </w:rPr>
               <w:t>cd &lt;chemin du dossier SCRIPT&gt;</w:t>
-              <w:br/>
-            </w:r>
-            <w:r>
-              <w:rPr>
-                <w:rFonts w:ascii="Consolas" w:hAnsi="Consolas"/>
-                <w:sz w:val="18"/>
-              </w:rPr>
-              <w:br/>
-            </w:r>
-            <w:r>
-              <w:rPr>
-                <w:rFonts w:ascii="Consolas" w:hAnsi="Consolas"/>
-                <w:sz w:val="18"/>
-              </w:rPr>
-              <w:t>export PGHOST=&lt;serveur&gt;</w:t>
-              <w:br/>
-            </w:r>
-            <w:r>
-              <w:rPr>
-                <w:rFonts w:ascii="Consolas" w:hAnsi="Consolas"/>
-                <w:sz w:val="18"/>
-              </w:rPr>
-              <w:t>export PGPORT=5432</w:t>
-              <w:br/>
-            </w:r>
-            <w:r>
-              <w:rPr>
-                <w:rFonts w:ascii="Consolas" w:hAnsi="Consolas"/>
-                <w:sz w:val="18"/>
-              </w:rPr>
-              <w:t>export PGDATABASE=&lt;base mSupply&gt;</w:t>
-              <w:br/>
-            </w:r>
-            <w:r>
-              <w:rPr>
-                <w:rFonts w:ascii="Consolas" w:hAnsi="Consolas"/>
-                <w:sz w:val="18"/>
-              </w:rPr>
-              <w:t>export PGUSER=&lt;compte en lecture seule&gt;</w:t>
-              <w:br/>
-            </w:r>
-            <w:r>
-              <w:rPr>
-                <w:rFonts w:ascii="Consolas" w:hAnsi="Consolas"/>
-                <w:sz w:val="18"/>
-              </w:rPr>
               <w:br/>
             </w:r>
             <w:r>
@@ -2830,7 +2906,7 @@
                 <w:b w:val="0"/>
                 <w:sz w:val="19"/>
               </w:rPr>
-              <w:t>définir PGHOST (ou PGDATABASE, PGUSER)</w:t>
+              <w:t>connexion.env absent</w:t>
             </w:r>
           </w:p>
         </w:tc>
@@ -2845,7 +2921,7 @@
                 <w:b w:val="0"/>
                 <w:sz w:val="19"/>
               </w:rPr>
-              <w:t>Variable de connexion oubliée</w:t>
+              <w:t>Fichier de connexion pas encore créé</w:t>
             </w:r>
           </w:p>
         </w:tc>
@@ -2860,7 +2936,101 @@
                 <w:b w:val="0"/>
                 <w:sz w:val="19"/>
               </w:rPr>
-              <w:t>Refaire les export de la section 6</w:t>
+              <w:t>Le créer à partir de connexion.exemple.env (section 3.1)</w:t>
+            </w:r>
+          </w:p>
+        </w:tc>
+      </w:tr>
+      <w:tr>
+        <w:tc>
+          <w:tcPr>
+            <w:tcW w:type="dxa" w:w="2948"/>
+          </w:tcPr>
+          <w:p>
+            <w:r/>
+            <w:r>
+              <w:rPr>
+                <w:b w:val="0"/>
+                <w:sz w:val="19"/>
+              </w:rPr>
+              <w:t>renseigner PGHOST (ou PGDATABASE, PGUSER) dans connexion.env</w:t>
+            </w:r>
+          </w:p>
+        </w:tc>
+        <w:tc>
+          <w:tcPr>
+            <w:tcW w:type="dxa" w:w="3061"/>
+          </w:tcPr>
+          <w:p>
+            <w:r/>
+            <w:r>
+              <w:rPr>
+                <w:b w:val="0"/>
+                <w:sz w:val="19"/>
+              </w:rPr>
+              <w:t>Ligne manquante ou vide dans connexion.env</w:t>
+            </w:r>
+          </w:p>
+        </w:tc>
+        <w:tc>
+          <w:tcPr>
+            <w:tcW w:type="dxa" w:w="3061"/>
+          </w:tcPr>
+          <w:p>
+            <w:r/>
+            <w:r>
+              <w:rPr>
+                <w:b w:val="0"/>
+                <w:sz w:val="19"/>
+              </w:rPr>
+              <w:t>Compléter la ligne indiquée</w:t>
+            </w:r>
+          </w:p>
+        </w:tc>
+      </w:tr>
+      <w:tr>
+        <w:tc>
+          <w:tcPr>
+            <w:tcW w:type="dxa" w:w="2948"/>
+          </w:tcPr>
+          <w:p>
+            <w:r/>
+            <w:r>
+              <w:rPr>
+                <w:b w:val="0"/>
+                <w:sz w:val="19"/>
+              </w:rPr>
+              <w:t>connexion.env ne doit pas contenir de mot de passe</w:t>
+            </w:r>
+          </w:p>
+        </w:tc>
+        <w:tc>
+          <w:tcPr>
+            <w:tcW w:type="dxa" w:w="3061"/>
+          </w:tcPr>
+          <w:p>
+            <w:r/>
+            <w:r>
+              <w:rPr>
+                <w:b w:val="0"/>
+                <w:sz w:val="19"/>
+              </w:rPr>
+              <w:t>Une ligne PGPASSWORD a été ajoutée</w:t>
+            </w:r>
+          </w:p>
+        </w:tc>
+        <w:tc>
+          <w:tcPr>
+            <w:tcW w:type="dxa" w:w="3061"/>
+          </w:tcPr>
+          <w:p>
+            <w:r/>
+            <w:r>
+              <w:rPr>
+                <w:b w:val="0"/>
+                <w:sz w:val="19"/>
+              </w:rPr>
+              <w:t>La retirer : le mot de passe est saisi à chaque lancement (section 3.2)</w:t>
             </w:r>
           </w:p>
         </w:tc>
@@ -2907,7 +3077,101 @@
                 <w:b w:val="0"/>
                 <w:sz w:val="19"/>
               </w:rPr>
-              <w:t>Vérifier .pgpass ou le compte</w:t>
+              <w:t>Relancer et retaper le mot de passe ; sinon vérifier PGUSER dans connexion.env</w:t>
+            </w:r>
+          </w:p>
+        </w:tc>
+      </w:tr>
+      <w:tr>
+        <w:tc>
+          <w:tcPr>
+            <w:tcW w:type="dxa" w:w="2948"/>
+          </w:tcPr>
+          <w:p>
+            <w:r/>
+            <w:r>
+              <w:rPr>
+                <w:b w:val="0"/>
+                <w:sz w:val="19"/>
+              </w:rPr>
+              <w:t>mot de passe vide : extraction annulée</w:t>
+            </w:r>
+          </w:p>
+        </w:tc>
+        <w:tc>
+          <w:tcPr>
+            <w:tcW w:type="dxa" w:w="3061"/>
+          </w:tcPr>
+          <w:p>
+            <w:r/>
+            <w:r>
+              <w:rPr>
+                <w:b w:val="0"/>
+                <w:sz w:val="19"/>
+              </w:rPr>
+              <w:t>Touche Entrée sans saisie</w:t>
+            </w:r>
+          </w:p>
+        </w:tc>
+        <w:tc>
+          <w:tcPr>
+            <w:tcW w:type="dxa" w:w="3061"/>
+          </w:tcPr>
+          <w:p>
+            <w:r/>
+            <w:r>
+              <w:rPr>
+                <w:b w:val="0"/>
+                <w:sz w:val="19"/>
+              </w:rPr>
+              <w:t>Relancer et taper le mot de passe</w:t>
+            </w:r>
+          </w:p>
+        </w:tc>
+      </w:tr>
+      <w:tr>
+        <w:tc>
+          <w:tcPr>
+            <w:tcW w:type="dxa" w:w="2948"/>
+          </w:tcPr>
+          <w:p>
+            <w:r/>
+            <w:r>
+              <w:rPr>
+                <w:b w:val="0"/>
+                <w:sz w:val="19"/>
+              </w:rPr>
+              <w:t>aucun terminal pour saisir le mot de passe</w:t>
+            </w:r>
+          </w:p>
+        </w:tc>
+        <w:tc>
+          <w:tcPr>
+            <w:tcW w:type="dxa" w:w="3061"/>
+          </w:tcPr>
+          <w:p>
+            <w:r/>
+            <w:r>
+              <w:rPr>
+                <w:b w:val="0"/>
+                <w:sz w:val="19"/>
+              </w:rPr>
+              <w:t>Script lancé hors d'un terminal (double-clic, tâche planifiée)</w:t>
+            </w:r>
+          </w:p>
+        </w:tc>
+        <w:tc>
+          <w:tcPr>
+            <w:tcW w:type="dxa" w:w="3061"/>
+          </w:tcPr>
+          <w:p>
+            <w:r/>
+            <w:r>
+              <w:rPr>
+                <w:b w:val="0"/>
+                <w:sz w:val="19"/>
+              </w:rPr>
+              <w:t>Le lancer depuis Git Bash</w:t>
             </w:r>
           </w:p>
         </w:tc>

</xml_diff>